<commit_message>
Add missing LAIF corpus cross-references with DOCX parity QA
</commit_message>
<xml_diff>
--- a/LAIF REGULATORY INTEGRATION GUIDE.docx
+++ b/LAIF REGULATORY INTEGRATION GUIDE.docx
@@ -84,6 +84,11 @@
         <w:rPr>
           <w:rtl w:val="0"/>
         </w:rPr>
+      </w:r>
+    </w:p>
+    <w:p>
+      <w:r>
+        <w:t>Related LAIF documents: LAIF v1.2 Principal Text · PDCA-Full Assessment (GPT-4 Clinical) · Compliance Toolkit v1.1 · Regulatory Integration Guide · Case Analysis · Policy Paper</w:t>
       </w:r>
     </w:p>
     <w:p>

</xml_diff>